<commit_message>
Re orden de archivos
Se ordenaron los archivos
</commit_message>
<xml_diff>
--- a/docs/Guia_comandos_controladores_Crazyflie.docx
+++ b/docs/Guia_comandos_controladores_Crazyflie.docx
@@ -500,7 +500,7 @@
                 <w:color w:val="111827"/>
                 <w:sz w:val="18"/>
               </w:rPr>
-              <w:t>.\.venv\Scripts\python.exe .\drone_control\diagnostico_flowdeck_dos_drones.py</w:t>
+              <w:t>.\.venv\Scripts\python.exe .\controllers\crazyflie\diagnostico_flowdeck_dos_drones.py</w:t>
             </w:r>
           </w:p>
         </w:tc>
@@ -559,7 +559,7 @@
                 <w:color w:val="111827"/>
                 <w:sz w:val="18"/>
               </w:rPr>
-              <w:t>.\.venv\Scripts\python.exe .\drone_control\diagnostico_flowdeck_dos_drones.py --tiempo 10</w:t>
+              <w:t>.\.venv\Scripts\python.exe .\controllers\crazyflie\diagnostico_flowdeck_dos_drones.py --tiempo 10</w:t>
             </w:r>
           </w:p>
         </w:tc>
@@ -618,7 +618,7 @@
                 <w:color w:val="111827"/>
                 <w:sz w:val="18"/>
               </w:rPr>
-              <w:t>.\.venv\Scripts\python.exe .\drone_control\diagnostico_flowdeck_dos_drones.py --radio1 2B1D933FCC --radio2 9DD2507072</w:t>
+              <w:t>.\.venv\Scripts\python.exe .\controllers\crazyflie\diagnostico_flowdeck_dos_drones.py --radio1 2B1D933FCC --radio2 9DD2507072</w:t>
             </w:r>
           </w:p>
         </w:tc>
@@ -730,7 +730,7 @@
                 <w:color w:val="111827"/>
                 <w:sz w:val="18"/>
               </w:rPr>
-              <w:t>.\.venv\Scripts\python.exe .\drone_control\hover_flowdeck_dron1.py</w:t>
+              <w:t>.\.venv\Scripts\python.exe .\controllers\crazyflie\hover_flowdeck_dron1.py</w:t>
             </w:r>
           </w:p>
         </w:tc>
@@ -789,7 +789,7 @@
                 <w:color w:val="111827"/>
                 <w:sz w:val="18"/>
               </w:rPr>
-              <w:t>.\.venv\Scripts\python.exe .\drone_control\hover_flowdeck_dron1.py --altura 0.45 --tiempo 10</w:t>
+              <w:t>.\.venv\Scripts\python.exe .\controllers\crazyflie\hover_flowdeck_dron1.py --altura 0.45 --tiempo 10</w:t>
             </w:r>
           </w:p>
         </w:tc>
@@ -848,7 +848,7 @@
                 <w:color w:val="111827"/>
                 <w:sz w:val="18"/>
               </w:rPr>
-              <w:t>.\.venv\Scripts\python.exe .\drone_control\hover_flowdeck_dron1.py --radio 9DD2507072</w:t>
+              <w:t>.\.venv\Scripts\python.exe .\controllers\crazyflie\hover_flowdeck_dron1.py --radio 9DD2507072</w:t>
             </w:r>
           </w:p>
         </w:tc>
@@ -1095,7 +1095,7 @@
                 <w:color w:val="111827"/>
                 <w:sz w:val="18"/>
               </w:rPr>
-              <w:t>.\.venv\Scripts\python.exe .\drone_control\panel_control_flowdeck_dron1.py</w:t>
+              <w:t>.\.venv\Scripts\python.exe .\controllers\crazyflie\panel_control_flowdeck_dron1.py</w:t>
             </w:r>
           </w:p>
         </w:tc>
@@ -1430,7 +1430,7 @@
                 <w:color w:val="111827"/>
                 <w:sz w:val="18"/>
               </w:rPr>
-              <w:t>.\.venv\Scripts\python.exe .\drone_control\control_camara_flowdeck_dron1.py</w:t>
+              <w:t>.\.venv\Scripts\python.exe .\controllers\crazyflie\control_camara_flowdeck_dron1.py</w:t>
             </w:r>
           </w:p>
         </w:tc>
@@ -1489,7 +1489,7 @@
                 <w:color w:val="111827"/>
                 <w:sz w:val="18"/>
               </w:rPr>
-              <w:t>.\.venv\Scripts\python.exe .\drone_control\control_camara_flowdeck_dron1.py --camera 1</w:t>
+              <w:t>.\.venv\Scripts\python.exe .\controllers\crazyflie\control_camara_flowdeck_dron1.py --camera 1</w:t>
             </w:r>
           </w:p>
         </w:tc>
@@ -1601,7 +1601,7 @@
                 <w:color w:val="111827"/>
                 <w:sz w:val="18"/>
               </w:rPr>
-              <w:t>.\.venv\Scripts\python.exe .\drone_control\panel_control_flowdeck_dos_drones.py</w:t>
+              <w:t>.\.venv\Scripts\python.exe .\controllers\crazyflie\panel_control_flowdeck_dos_drones.py</w:t>
             </w:r>
           </w:p>
         </w:tc>
@@ -2014,7 +2014,7 @@
                 <w:color w:val="111827"/>
                 <w:sz w:val="18"/>
               </w:rPr>
-              <w:t>.\.venv\Scripts\python.exe .\drone_control\control_camara_flowdeck_dos_drones.py --target hands</w:t>
+              <w:t>.\.venv\Scripts\python.exe .\controllers\crazyflie\control_camara_flowdeck_dos_drones.py --target hands</w:t>
             </w:r>
           </w:p>
         </w:tc>
@@ -2073,7 +2073,7 @@
                 <w:color w:val="111827"/>
                 <w:sz w:val="18"/>
               </w:rPr>
-              <w:t>.\.venv\Scripts\python.exe .\drone_control\control_camara_flowdeck_dos_drones.py --target drone1</w:t>
+              <w:t>.\.venv\Scripts\python.exe .\controllers\crazyflie\control_camara_flowdeck_dos_drones.py --target drone1</w:t>
             </w:r>
           </w:p>
         </w:tc>
@@ -2132,7 +2132,7 @@
                 <w:color w:val="111827"/>
                 <w:sz w:val="18"/>
               </w:rPr>
-              <w:t>.\.venv\Scripts\python.exe .\drone_control\control_camara_flowdeck_dos_drones.py --target drone2</w:t>
+              <w:t>.\.venv\Scripts\python.exe .\controllers\crazyflie\control_camara_flowdeck_dos_drones.py --target drone2</w:t>
             </w:r>
           </w:p>
         </w:tc>
@@ -2191,7 +2191,7 @@
                 <w:color w:val="111827"/>
                 <w:sz w:val="18"/>
               </w:rPr>
-              <w:t>.\.venv\Scripts\python.exe .\drone_control\control_camara_flowdeck_dos_drones.py --target both</w:t>
+              <w:t>.\.venv\Scripts\python.exe .\controllers\crazyflie\control_camara_flowdeck_dos_drones.py --target both</w:t>
             </w:r>
           </w:p>
         </w:tc>
@@ -2776,7 +2776,7 @@
                 <w:color w:val="111827"/>
                 <w:sz w:val="18"/>
               </w:rPr>
-              <w:t>.\.venv\Scripts\python.exe .\drone_control\control_dron_individual_interfaz.py --drone 1</w:t>
+              <w:t>.\.venv\Scripts\python.exe .\controllers\crazyflie\control_dron_individual_interfaz.py --drone 1</w:t>
             </w:r>
           </w:p>
         </w:tc>
@@ -2835,7 +2835,7 @@
                 <w:color w:val="111827"/>
                 <w:sz w:val="18"/>
               </w:rPr>
-              <w:t>.\.venv\Scripts\python.exe .\drone_control\control_dron_individual_interfaz.py --drone 2</w:t>
+              <w:t>.\.venv\Scripts\python.exe .\controllers\crazyflie\control_dron_individual_interfaz.py --drone 2</w:t>
             </w:r>
           </w:p>
         </w:tc>
@@ -2902,7 +2902,7 @@
                 <w:color w:val="111827"/>
                 <w:sz w:val="18"/>
               </w:rPr>
-              <w:t>.\.venv\Scripts\python.exe .\drone_control\control_dos_drones_botones_lowlevel.py</w:t>
+              <w:t>.\.venv\Scripts\python.exe .\controllers\crazyflie\control_dos_drones_botones_lowlevel.py</w:t>
             </w:r>
           </w:p>
         </w:tc>
@@ -2961,7 +2961,7 @@
                 <w:color w:val="111827"/>
                 <w:sz w:val="18"/>
               </w:rPr>
-              <w:t>.\.venv\Scripts\python.exe .\drone_control\control_dos_drones_cruz_botones.py</w:t>
+              <w:t>.\.venv\Scripts\python.exe .\controllers\crazyflie\control_dos_drones_cruz_botones.py</w:t>
             </w:r>
           </w:p>
         </w:tc>
@@ -3020,7 +3020,7 @@
                 <w:color w:val="111827"/>
                 <w:sz w:val="18"/>
               </w:rPr>
-              <w:t>.\.venv\Scripts\python.exe .\drone_control\control_dos_drones_cruz_botones.py --dry-run</w:t>
+              <w:t>.\.venv\Scripts\python.exe .\controllers\crazyflie\control_dos_drones_cruz_botones.py --dry-run</w:t>
             </w:r>
           </w:p>
         </w:tc>
@@ -3079,7 +3079,7 @@
                 <w:color w:val="111827"/>
                 <w:sz w:val="18"/>
               </w:rPr>
-              <w:t>.\.venv\Scripts\python.exe .\drone_control\control_dos_drones_cruz_botones.py --single drone2</w:t>
+              <w:t>.\.venv\Scripts\python.exe .\controllers\crazyflie\control_dos_drones_cruz_botones.py --single drone2</w:t>
             </w:r>
           </w:p>
         </w:tc>
@@ -3205,7 +3205,7 @@
                 <w:color w:val="111827"/>
                 <w:sz w:val="18"/>
               </w:rPr>
-              <w:t>.\.venv\Scripts\python.exe .\drone_control\control_dos_drones_cruz_camara_multiprocessing.py --target drone2</w:t>
+              <w:t>.\.venv\Scripts\python.exe .\controllers\crazyflie\control_dos_drones_cruz_camara_multiprocessing.py --target drone2</w:t>
             </w:r>
           </w:p>
         </w:tc>
@@ -3264,7 +3264,7 @@
                 <w:color w:val="111827"/>
                 <w:sz w:val="18"/>
               </w:rPr>
-              <w:t>.\.venv\Scripts\python.exe .\drone_control\control_dos_drones_cruz_camara_multiprocessing.py --dry-run</w:t>
+              <w:t>.\.venv\Scripts\python.exe .\controllers\crazyflie\control_dos_drones_cruz_camara_multiprocessing.py --dry-run</w:t>
             </w:r>
           </w:p>
         </w:tc>
@@ -3331,7 +3331,7 @@
                 <w:color w:val="111827"/>
                 <w:sz w:val="18"/>
               </w:rPr>
-              <w:t>.\.venv\Scripts\python.exe .\drone_controll_with_marker\discover_marker_id.py --id 64 --show-all</w:t>
+              <w:t>.\.venv\Scripts\python.exe .\controllers\marker\discover_marker_id.py --id 64 --show-all</w:t>
             </w:r>
           </w:p>
         </w:tc>
@@ -3390,7 +3390,7 @@
                 <w:color w:val="111827"/>
                 <w:sz w:val="18"/>
               </w:rPr>
-              <w:t>.\.venv\Scripts\python.exe .\drone_controll_with_marker\marker_orientation_check.py --marker-topic mocap/all --marker-id 64</w:t>
+              <w:t>.\.venv\Scripts\python.exe .\controllers\marker\marker_orientation_check.py --marker-topic mocap/all --marker-id 64</w:t>
             </w:r>
           </w:p>
         </w:tc>
@@ -3449,7 +3449,7 @@
                 <w:color w:val="111827"/>
                 <w:sz w:val="18"/>
               </w:rPr>
-              <w:t>.\.venv\Scripts\python.exe .\drone_controll_with_marker\control_with_marker.py --marker-topic mocap/all --marker-id 64</w:t>
+              <w:t>.\.venv\Scripts\python.exe .\controllers\marker\control_with_marker.py --marker-topic mocap/all --marker-id 64</w:t>
             </w:r>
           </w:p>
         </w:tc>
@@ -3508,7 +3508,7 @@
                 <w:color w:val="111827"/>
                 <w:sz w:val="18"/>
               </w:rPr>
-              <w:t>.\.venv\Scripts\python.exe .\drone_controll_with_marker\analyze_marker_session.py</w:t>
+              <w:t>.\.venv\Scripts\python.exe .\controllers\marker\analyze_marker_session.py</w:t>
             </w:r>
           </w:p>
         </w:tc>
@@ -3575,7 +3575,7 @@
                 <w:color w:val="111827"/>
                 <w:sz w:val="18"/>
               </w:rPr>
-              <w:t>.\.venv\Scripts\python.exe .\Gesture_control\main_hands.py</w:t>
+              <w:t>.\.venv\Scripts\python.exe .\external\gesture_detection\main_hands.py</w:t>
             </w:r>
           </w:p>
         </w:tc>
@@ -3634,7 +3634,7 @@
                 <w:color w:val="111827"/>
                 <w:sz w:val="18"/>
               </w:rPr>
-              <w:t>.\.venv\Scripts\python.exe .\drone_control\prueba_estabilidad_dos_drones_lowlevel.py</w:t>
+              <w:t>.\.venv\Scripts\python.exe .\controllers\crazyflie\prueba_estabilidad_dos_drones_lowlevel.py</w:t>
             </w:r>
           </w:p>
         </w:tc>
@@ -3693,7 +3693,7 @@
                 <w:color w:val="111827"/>
                 <w:sz w:val="18"/>
               </w:rPr>
-              <w:t>.\.venv\Scripts\python.exe .\drone_control\analizar_sesion_dos_drones.py</w:t>
+              <w:t>.\.venv\Scripts\python.exe .\controllers\crazyflie\analizar_sesion_dos_drones.py</w:t>
             </w:r>
           </w:p>
         </w:tc>

</xml_diff>